<commit_message>
Update Instruction for the Car Kit.docx
</commit_message>
<xml_diff>
--- a/MaUWB_AOA Gen2  4WD Auto-following Robot Platform/Instruction for the Car Kit.docx
+++ b/MaUWB_AOA Gen2  4WD Auto-following Robot Platform/Instruction for the Car Kit.docx
@@ -134,25 +134,100 @@
     <w:p>
       <w:pPr>
         <w:rPr>
-          <w:rFonts w:hint="default"/>
-          <w:lang w:val="en-US" w:eastAsia="zh-CN"/>
-        </w:rPr>
-      </w:pPr>
-      <w:r>
-        <w:rPr>
-          <w:rFonts w:hint="eastAsia"/>
-          <w:lang w:val="en-US" w:eastAsia="zh-CN"/>
-        </w:rPr>
-        <w:t>3.Open &amp; Connect JL_Assistant.</w:t>
-      </w:r>
-    </w:p>
-    <w:p>
-      <w:pPr>
-        <w:rPr>
-          <w:rFonts w:hint="eastAsia"/>
-          <w:lang w:val="en-US" w:eastAsia="zh-CN"/>
-        </w:rPr>
-      </w:pPr>
+          <w:rFonts w:hint="eastAsia"/>
+          <w:lang w:val="en-US" w:eastAsia="zh-CN"/>
+        </w:rPr>
+      </w:pPr>
+      <w:r>
+        <w:rPr>
+          <w:rFonts w:hint="eastAsia"/>
+          <w:lang w:val="en-US" w:eastAsia="zh-CN"/>
+        </w:rPr>
+        <w:t>3.Extract the compressed file.The link is as follows:</w:t>
+      </w:r>
+    </w:p>
+    <w:p>
+      <w:pPr>
+        <w:jc w:val="left"/>
+        <w:rPr>
+          <w:rFonts w:hint="default" w:eastAsia="宋体" w:cs="宋体" w:asciiTheme="minorAscii" w:hAnsiTheme="minorAscii"/>
+          <w:sz w:val="21"/>
+          <w:szCs w:val="21"/>
+        </w:rPr>
+      </w:pPr>
+      <w:r>
+        <w:rPr>
+          <w:rFonts w:hint="default" w:eastAsia="宋体" w:cs="宋体" w:asciiTheme="minorAscii" w:hAnsiTheme="minorAscii"/>
+          <w:sz w:val="21"/>
+          <w:szCs w:val="21"/>
+        </w:rPr>
+        <w:fldChar w:fldCharType="begin"/>
+      </w:r>
+      <w:r>
+        <w:rPr>
+          <w:rFonts w:hint="default" w:eastAsia="宋体" w:cs="宋体" w:asciiTheme="minorAscii" w:hAnsiTheme="minorAscii"/>
+          <w:sz w:val="21"/>
+          <w:szCs w:val="21"/>
+        </w:rPr>
+        <w:instrText xml:space="preserve"> HYPERLINK "https://github.com/Makerfabs/MaUWB_AOA-Gen2/blob/main/MaUWB_AOA_Assistant.zip" </w:instrText>
+      </w:r>
+      <w:r>
+        <w:rPr>
+          <w:rFonts w:hint="default" w:eastAsia="宋体" w:cs="宋体" w:asciiTheme="minorAscii" w:hAnsiTheme="minorAscii"/>
+          <w:sz w:val="21"/>
+          <w:szCs w:val="21"/>
+        </w:rPr>
+        <w:fldChar w:fldCharType="separate"/>
+      </w:r>
+      <w:r>
+        <w:rPr>
+          <w:rStyle w:val="6"/>
+          <w:rFonts w:hint="default" w:eastAsia="宋体" w:cs="宋体" w:asciiTheme="minorAscii" w:hAnsiTheme="minorAscii"/>
+          <w:sz w:val="21"/>
+          <w:szCs w:val="21"/>
+        </w:rPr>
+        <w:t>MaUWB_AOA-Gen2/MaUWB_AOA_Assistant.zip at main · Makerfabs/MaUWB_AOA-Gen2</w:t>
+      </w:r>
+      <w:r>
+        <w:rPr>
+          <w:rFonts w:hint="default" w:eastAsia="宋体" w:cs="宋体" w:asciiTheme="minorAscii" w:hAnsiTheme="minorAscii"/>
+          <w:sz w:val="21"/>
+          <w:szCs w:val="21"/>
+        </w:rPr>
+        <w:fldChar w:fldCharType="end"/>
+      </w:r>
+    </w:p>
+    <w:p>
+      <w:pPr>
+        <w:jc w:val="left"/>
+        <w:rPr>
+          <w:rFonts w:hint="default" w:eastAsia="宋体" w:cs="宋体" w:asciiTheme="minorAscii" w:hAnsiTheme="minorAscii"/>
+          <w:sz w:val="21"/>
+          <w:szCs w:val="21"/>
+        </w:rPr>
+      </w:pPr>
+    </w:p>
+    <w:p>
+      <w:pPr>
+        <w:jc w:val="left"/>
+        <w:rPr>
+          <w:rFonts w:hint="default" w:eastAsia="宋体" w:cs="宋体" w:asciiTheme="minorAscii" w:hAnsiTheme="minorAscii"/>
+          <w:sz w:val="21"/>
+          <w:szCs w:val="21"/>
+          <w:lang w:val="en-US" w:eastAsia="zh-CN"/>
+        </w:rPr>
+      </w:pPr>
+      <w:r>
+        <w:rPr>
+          <w:rFonts w:hint="eastAsia" w:eastAsia="宋体" w:cs="宋体" w:asciiTheme="minorAscii" w:hAnsiTheme="minorAscii"/>
+          <w:sz w:val="21"/>
+          <w:szCs w:val="21"/>
+          <w:lang w:val="en-US" w:eastAsia="zh-CN"/>
+        </w:rPr>
+        <w:t>4.Open &amp; Connect JL_Assistant.exe</w:t>
+      </w:r>
+      <w:bookmarkStart w:id="0" w:name="_GoBack"/>
+      <w:bookmarkEnd w:id="0"/>
     </w:p>
     <w:p>
       <w:r>
@@ -1201,8 +1276,6 @@
           </wp:inline>
         </w:drawing>
       </w:r>
-      <w:bookmarkStart w:id="0" w:name="_GoBack"/>
-      <w:bookmarkEnd w:id="0"/>
     </w:p>
     <w:sectPr>
       <w:pgSz w:w="11906" w:h="16838"/>
@@ -1527,6 +1600,24 @@
       </w:tblCellMar>
     </w:tblPr>
   </w:style>
+  <w:style w:type="character" w:styleId="5">
+    <w:name w:val="FollowedHyperlink"/>
+    <w:basedOn w:val="4"/>
+    <w:uiPriority w:val="0"/>
+    <w:rPr>
+      <w:color w:val="800080"/>
+      <w:u w:val="single"/>
+    </w:rPr>
+  </w:style>
+  <w:style w:type="character" w:styleId="6">
+    <w:name w:val="Hyperlink"/>
+    <w:basedOn w:val="4"/>
+    <w:uiPriority w:val="0"/>
+    <w:rPr>
+      <w:color w:val="0000FF"/>
+      <w:u w:val="single"/>
+    </w:rPr>
+  </w:style>
 </w:styles>
 </file>
 

</xml_diff>